<commit_message>
Update Smart Alarm Clock design document
</commit_message>
<xml_diff>
--- a/app/web/static/portfolio/smart_alarm_clock_report.docx
+++ b/app/web/static/portfolio/smart_alarm_clock_report.docx
@@ -342,7 +342,7 @@
           <w:szCs w:val="32"/>
           <w:lang w:val="en-US" w:eastAsia="zh-CN"/>
         </w:rPr>
-        <w:t>Liu Moxin/299102</w:t>
+        <w:t>Liu Moxin</w:t>
       </w:r>
     </w:p>
     <w:p>
@@ -388,30 +388,6 @@
         </w:rPr>
         <w:tab/>
       </w:r>
-      <w:r>
-        <w:rPr>
-          <w:rFonts w:ascii="Arial" w:hAnsi="Arial" w:cs="Arial"/>
-          <w:b/>
-          <w:bCs/>
-          <w:color w:val="000000"/>
-          <w:sz w:val="32"/>
-          <w:szCs w:val="32"/>
-          <w:lang w:val="en-US"/>
-        </w:rPr>
-        <w:t>Group member:</w:t>
-      </w:r>
-      <w:r>
-        <w:rPr>
-          <w:rFonts w:hint="eastAsia" w:ascii="Arial" w:hAnsi="Arial" w:eastAsia="宋体" w:cs="Arial"/>
-          <w:b/>
-          <w:bCs/>
-          <w:color w:val="000000"/>
-          <w:sz w:val="32"/>
-          <w:szCs w:val="32"/>
-          <w:lang w:val="en-US" w:eastAsia="zh-CN"/>
-        </w:rPr>
-        <w:t>Zhou zhuoli</w:t>
-      </w:r>
     </w:p>
     <w:p>
       <w:pPr>
@@ -456,30 +432,8 @@
         </w:rPr>
         <w:tab/>
       </w:r>
-      <w:r>
-        <w:rPr>
-          <w:rFonts w:ascii="Arial" w:hAnsi="Arial" w:cs="Arial"/>
-          <w:b/>
-          <w:bCs/>
-          <w:color w:val="000000"/>
-          <w:sz w:val="32"/>
-          <w:szCs w:val="32"/>
-          <w:lang w:val="en-US"/>
-        </w:rPr>
-        <w:t xml:space="preserve">DATE : </w:t>
-      </w:r>
-      <w:r>
-        <w:rPr>
-          <w:rFonts w:hint="eastAsia" w:ascii="Arial" w:hAnsi="Arial" w:eastAsia="宋体" w:cs="Arial"/>
-          <w:b/>
-          <w:bCs/>
-          <w:color w:val="000000"/>
-          <w:sz w:val="32"/>
-          <w:szCs w:val="32"/>
-          <w:lang w:val="en-US" w:eastAsia="zh-CN"/>
-        </w:rPr>
-        <w:t>2024/1/30</w:t>
-      </w:r>
+      <w:bookmarkStart w:id="0" w:name="_GoBack"/>
+      <w:bookmarkEnd w:id="0"/>
     </w:p>
     <w:p>
       <w:pPr>
@@ -3555,8 +3509,6 @@
           <w:lang w:eastAsia="zh-CN"/>
         </w:rPr>
       </w:pPr>
-      <w:bookmarkStart w:id="0" w:name="_GoBack"/>
-      <w:bookmarkEnd w:id="0"/>
     </w:p>
     <w:p>
       <w:pPr>

</xml_diff>